<commit_message>
Update Word document: Remove incorrect header
</commit_message>
<xml_diff>
--- a/22003155_BuiManhHieu_Tuan01.docx
+++ b/22003155_BuiManhHieu_Tuan01.docx
@@ -33,7 +33,7 @@
                     <pic:cNvPicPr/>
                   </pic:nvPicPr>
                   <pic:blipFill>
-                    <a:blip r:embed="rId6" cstate="print">
+                    <a:blip r:embed="rId7" cstate="print">
                       <a:extLst>
                         <a:ext uri="{28A0092B-C50C-407E-A947-70E740481C1C}">
                           <a14:useLocalDpi xmlns:a14="http://schemas.microsoft.com/office/drawing/2010/main" val="0"/>
@@ -164,7 +164,7 @@
                     <pic:cNvPicPr/>
                   </pic:nvPicPr>
                   <pic:blipFill>
-                    <a:blip r:embed="rId7">
+                    <a:blip r:embed="rId8">
                       <a:extLst>
                         <a:ext uri="{28A0092B-C50C-407E-A947-70E740481C1C}">
                           <a14:useLocalDpi xmlns:a14="http://schemas.microsoft.com/office/drawing/2010/main" val="0"/>
@@ -299,7 +299,7 @@
                     <pic:cNvPicPr/>
                   </pic:nvPicPr>
                   <pic:blipFill>
-                    <a:blip r:embed="rId8" cstate="print">
+                    <a:blip r:embed="rId9" cstate="print">
                       <a:extLst>
                         <a:ext uri="{28A0092B-C50C-407E-A947-70E740481C1C}">
                           <a14:useLocalDpi xmlns:a14="http://schemas.microsoft.com/office/drawing/2010/main" val="0"/>
@@ -357,7 +357,7 @@
                     <pic:cNvPicPr/>
                   </pic:nvPicPr>
                   <pic:blipFill>
-                    <a:blip r:embed="rId9" cstate="print">
+                    <a:blip r:embed="rId10" cstate="print">
                       <a:extLst>
                         <a:ext uri="{28A0092B-C50C-407E-A947-70E740481C1C}">
                           <a14:useLocalDpi xmlns:a14="http://schemas.microsoft.com/office/drawing/2010/main" val="0"/>
@@ -416,7 +416,7 @@
                     <pic:cNvPicPr/>
                   </pic:nvPicPr>
                   <pic:blipFill>
-                    <a:blip r:embed="rId10" cstate="print">
+                    <a:blip r:embed="rId11" cstate="print">
                       <a:extLst>
                         <a:ext uri="{28A0092B-C50C-407E-A947-70E740481C1C}">
                           <a14:useLocalDpi xmlns:a14="http://schemas.microsoft.com/office/drawing/2010/main" val="0"/>
@@ -465,7 +465,7 @@
                     <pic:cNvPicPr/>
                   </pic:nvPicPr>
                   <pic:blipFill>
-                    <a:blip r:embed="rId11" cstate="print">
+                    <a:blip r:embed="rId12" cstate="print">
                       <a:extLst>
                         <a:ext uri="{28A0092B-C50C-407E-A947-70E740481C1C}">
                           <a14:useLocalDpi xmlns:a14="http://schemas.microsoft.com/office/drawing/2010/main" val="0"/>
@@ -533,7 +533,7 @@
                     <pic:cNvPicPr/>
                   </pic:nvPicPr>
                   <pic:blipFill>
-                    <a:blip r:embed="rId12" cstate="print">
+                    <a:blip r:embed="rId13" cstate="print">
                       <a:extLst>
                         <a:ext uri="{28A0092B-C50C-407E-A947-70E740481C1C}">
                           <a14:useLocalDpi xmlns:a14="http://schemas.microsoft.com/office/drawing/2010/main" val="0"/>
@@ -591,7 +591,7 @@
                     <pic:cNvPicPr/>
                   </pic:nvPicPr>
                   <pic:blipFill>
-                    <a:blip r:embed="rId13" cstate="print">
+                    <a:blip r:embed="rId14" cstate="print">
                       <a:extLst>
                         <a:ext uri="{28A0092B-C50C-407E-A947-70E740481C1C}">
                           <a14:useLocalDpi xmlns:a14="http://schemas.microsoft.com/office/drawing/2010/main" val="0"/>
@@ -650,7 +650,7 @@
                     <pic:cNvPicPr/>
                   </pic:nvPicPr>
                   <pic:blipFill>
-                    <a:blip r:embed="rId14" cstate="print">
+                    <a:blip r:embed="rId15" cstate="print">
                       <a:extLst>
                         <a:ext uri="{28A0092B-C50C-407E-A947-70E740481C1C}">
                           <a14:useLocalDpi xmlns:a14="http://schemas.microsoft.com/office/drawing/2010/main" val="0"/>
@@ -724,101 +724,6 @@
                 <pic:pic xmlns:pic="http://schemas.openxmlformats.org/drawingml/2006/picture">
                   <pic:nvPicPr>
                     <pic:cNvPr id="27" name="Picture 27"/>
-                    <pic:cNvPicPr/>
-                  </pic:nvPicPr>
-                  <pic:blipFill>
-                    <a:blip r:embed="rId15" cstate="print">
-                      <a:extLst>
-                        <a:ext uri="{28A0092B-C50C-407E-A947-70E740481C1C}">
-                          <a14:useLocalDpi xmlns:a14="http://schemas.microsoft.com/office/drawing/2010/main" val="0"/>
-                        </a:ext>
-                      </a:extLst>
-                    </a:blip>
-                    <a:stretch>
-                      <a:fillRect/>
-                    </a:stretch>
-                  </pic:blipFill>
-                  <pic:spPr>
-                    <a:xfrm>
-                      <a:off x="0" y="0"/>
-                      <a:ext cx="5943600" cy="3860165"/>
-                    </a:xfrm>
-                    <a:prstGeom prst="rect">
-                      <a:avLst/>
-                    </a:prstGeom>
-                  </pic:spPr>
-                </pic:pic>
-              </a:graphicData>
-            </a:graphic>
-          </wp:inline>
-        </w:drawing>
-      </w:r>
-    </w:p>
-    <w:p>
-      <w:pPr>
-        <w:rPr>
-          <w:rFonts w:ascii="Times New Roman" w:hAnsi="Times New Roman" w:cs="Times New Roman"/>
-          <w:sz w:val="26"/>
-          <w:szCs w:val="26"/>
-        </w:rPr>
-      </w:pPr>
-      <w:r>
-        <w:rPr>
-          <w:rFonts w:ascii="Times New Roman" w:hAnsi="Times New Roman" w:cs="Times New Roman"/>
-          <w:sz w:val="26"/>
-          <w:szCs w:val="26"/>
-        </w:rPr>
-        <w:br w:type="page"/>
-      </w:r>
-    </w:p>
-    <w:p>
-      <w:pPr>
-        <w:rPr>
-          <w:rFonts w:ascii="Times New Roman" w:hAnsi="Times New Roman" w:cs="Times New Roman"/>
-          <w:b/>
-          <w:sz w:val="26"/>
-          <w:szCs w:val="26"/>
-        </w:rPr>
-      </w:pPr>
-      <w:r>
-        <w:rPr>
-          <w:rFonts w:ascii="Times New Roman" w:hAnsi="Times New Roman" w:cs="Times New Roman"/>
-          <w:b/>
-          <w:sz w:val="26"/>
-          <w:szCs w:val="26"/>
-        </w:rPr>
-        <w:lastRenderedPageBreak/>
-        <w:t>POST</w:t>
-      </w:r>
-    </w:p>
-    <w:p>
-      <w:pPr>
-        <w:rPr>
-          <w:rFonts w:ascii="Times New Roman" w:hAnsi="Times New Roman" w:cs="Times New Roman"/>
-          <w:sz w:val="26"/>
-          <w:szCs w:val="26"/>
-        </w:rPr>
-      </w:pPr>
-      <w:r>
-        <w:rPr>
-          <w:rFonts w:ascii="Times New Roman" w:hAnsi="Times New Roman" w:cs="Times New Roman"/>
-          <w:noProof/>
-          <w:sz w:val="26"/>
-          <w:szCs w:val="26"/>
-        </w:rPr>
-        <w:drawing>
-          <wp:inline distT="0" distB="0" distL="0" distR="0" wp14:anchorId="29967E98" wp14:editId="5C1A0969">
-            <wp:extent cx="5943600" cy="3860165"/>
-            <wp:effectExtent l="0" t="0" r="0" b="635"/>
-            <wp:docPr id="28" name="Picture 28"/>
-            <wp:cNvGraphicFramePr>
-              <a:graphicFrameLocks xmlns:a="http://schemas.openxmlformats.org/drawingml/2006/main" noChangeAspect="1"/>
-            </wp:cNvGraphicFramePr>
-            <a:graphic xmlns:a="http://schemas.openxmlformats.org/drawingml/2006/main">
-              <a:graphicData uri="http://schemas.openxmlformats.org/drawingml/2006/picture">
-                <pic:pic xmlns:pic="http://schemas.openxmlformats.org/drawingml/2006/picture">
-                  <pic:nvPicPr>
-                    <pic:cNvPr id="28" name="Picture 28"/>
                     <pic:cNvPicPr/>
                   </pic:nvPicPr>
                   <pic:blipFill>
@@ -860,6 +765,101 @@
       <w:r>
         <w:rPr>
           <w:rFonts w:ascii="Times New Roman" w:hAnsi="Times New Roman" w:cs="Times New Roman"/>
+          <w:sz w:val="26"/>
+          <w:szCs w:val="26"/>
+        </w:rPr>
+        <w:br w:type="page"/>
+      </w:r>
+    </w:p>
+    <w:p>
+      <w:pPr>
+        <w:rPr>
+          <w:rFonts w:ascii="Times New Roman" w:hAnsi="Times New Roman" w:cs="Times New Roman"/>
+          <w:b/>
+          <w:sz w:val="26"/>
+          <w:szCs w:val="26"/>
+        </w:rPr>
+      </w:pPr>
+      <w:r>
+        <w:rPr>
+          <w:rFonts w:ascii="Times New Roman" w:hAnsi="Times New Roman" w:cs="Times New Roman"/>
+          <w:b/>
+          <w:sz w:val="26"/>
+          <w:szCs w:val="26"/>
+        </w:rPr>
+        <w:lastRenderedPageBreak/>
+        <w:t>POST</w:t>
+      </w:r>
+    </w:p>
+    <w:p>
+      <w:pPr>
+        <w:rPr>
+          <w:rFonts w:ascii="Times New Roman" w:hAnsi="Times New Roman" w:cs="Times New Roman"/>
+          <w:sz w:val="26"/>
+          <w:szCs w:val="26"/>
+        </w:rPr>
+      </w:pPr>
+      <w:r>
+        <w:rPr>
+          <w:rFonts w:ascii="Times New Roman" w:hAnsi="Times New Roman" w:cs="Times New Roman"/>
+          <w:noProof/>
+          <w:sz w:val="26"/>
+          <w:szCs w:val="26"/>
+        </w:rPr>
+        <w:drawing>
+          <wp:inline distT="0" distB="0" distL="0" distR="0" wp14:anchorId="29967E98" wp14:editId="5C1A0969">
+            <wp:extent cx="5943600" cy="3860165"/>
+            <wp:effectExtent l="0" t="0" r="0" b="635"/>
+            <wp:docPr id="28" name="Picture 28"/>
+            <wp:cNvGraphicFramePr>
+              <a:graphicFrameLocks xmlns:a="http://schemas.openxmlformats.org/drawingml/2006/main" noChangeAspect="1"/>
+            </wp:cNvGraphicFramePr>
+            <a:graphic xmlns:a="http://schemas.openxmlformats.org/drawingml/2006/main">
+              <a:graphicData uri="http://schemas.openxmlformats.org/drawingml/2006/picture">
+                <pic:pic xmlns:pic="http://schemas.openxmlformats.org/drawingml/2006/picture">
+                  <pic:nvPicPr>
+                    <pic:cNvPr id="28" name="Picture 28"/>
+                    <pic:cNvPicPr/>
+                  </pic:nvPicPr>
+                  <pic:blipFill>
+                    <a:blip r:embed="rId17" cstate="print">
+                      <a:extLst>
+                        <a:ext uri="{28A0092B-C50C-407E-A947-70E740481C1C}">
+                          <a14:useLocalDpi xmlns:a14="http://schemas.microsoft.com/office/drawing/2010/main" val="0"/>
+                        </a:ext>
+                      </a:extLst>
+                    </a:blip>
+                    <a:stretch>
+                      <a:fillRect/>
+                    </a:stretch>
+                  </pic:blipFill>
+                  <pic:spPr>
+                    <a:xfrm>
+                      <a:off x="0" y="0"/>
+                      <a:ext cx="5943600" cy="3860165"/>
+                    </a:xfrm>
+                    <a:prstGeom prst="rect">
+                      <a:avLst/>
+                    </a:prstGeom>
+                  </pic:spPr>
+                </pic:pic>
+              </a:graphicData>
+            </a:graphic>
+          </wp:inline>
+        </w:drawing>
+      </w:r>
+    </w:p>
+    <w:p>
+      <w:pPr>
+        <w:rPr>
+          <w:rFonts w:ascii="Times New Roman" w:hAnsi="Times New Roman" w:cs="Times New Roman"/>
+          <w:sz w:val="26"/>
+          <w:szCs w:val="26"/>
+        </w:rPr>
+      </w:pPr>
+      <w:r>
+        <w:rPr>
+          <w:rFonts w:ascii="Times New Roman" w:hAnsi="Times New Roman" w:cs="Times New Roman"/>
           <w:noProof/>
           <w:sz w:val="26"/>
           <w:szCs w:val="26"/>
@@ -881,7 +881,7 @@
                     <pic:cNvPicPr/>
                   </pic:nvPicPr>
                   <pic:blipFill>
-                    <a:blip r:embed="rId17" cstate="print">
+                    <a:blip r:embed="rId18" cstate="print">
                       <a:extLst>
                         <a:ext uri="{28A0092B-C50C-407E-A947-70E740481C1C}">
                           <a14:useLocalDpi xmlns:a14="http://schemas.microsoft.com/office/drawing/2010/main" val="0"/>
@@ -939,7 +939,7 @@
                     <pic:cNvPicPr/>
                   </pic:nvPicPr>
                   <pic:blipFill>
-                    <a:blip r:embed="rId18" cstate="print">
+                    <a:blip r:embed="rId19" cstate="print">
                       <a:extLst>
                         <a:ext uri="{28A0092B-C50C-407E-A947-70E740481C1C}">
                           <a14:useLocalDpi xmlns:a14="http://schemas.microsoft.com/office/drawing/2010/main" val="0"/>
@@ -1023,7 +1023,7 @@
                     <pic:cNvPicPr/>
                   </pic:nvPicPr>
                   <pic:blipFill>
-                    <a:blip r:embed="rId19" cstate="print">
+                    <a:blip r:embed="rId20" cstate="print">
                       <a:extLst>
                         <a:ext uri="{28A0092B-C50C-407E-A947-70E740481C1C}">
                           <a14:useLocalDpi xmlns:a14="http://schemas.microsoft.com/office/drawing/2010/main" val="0"/>
@@ -1082,7 +1082,7 @@
                     <pic:cNvPicPr/>
                   </pic:nvPicPr>
                   <pic:blipFill>
-                    <a:blip r:embed="rId20" cstate="print">
+                    <a:blip r:embed="rId21" cstate="print">
                       <a:extLst>
                         <a:ext uri="{28A0092B-C50C-407E-A947-70E740481C1C}">
                           <a14:useLocalDpi xmlns:a14="http://schemas.microsoft.com/office/drawing/2010/main" val="0"/>
@@ -1119,8 +1119,12 @@
       </w:pPr>
     </w:p>
     <w:sectPr>
-      <w:headerReference w:type="default" r:id="rId21"/>
-      <w:footerReference w:type="default" r:id="rId22"/>
+      <w:headerReference w:type="even" r:id="rId22"/>
+      <w:headerReference w:type="default" r:id="rId23"/>
+      <w:footerReference w:type="even" r:id="rId24"/>
+      <w:footerReference w:type="default" r:id="rId25"/>
+      <w:headerReference w:type="first" r:id="rId26"/>
+      <w:footerReference w:type="first" r:id="rId27"/>
       <w:pgSz w:w="12240" w:h="15840"/>
       <w:pgMar w:top="1440" w:right="1440" w:bottom="1440" w:left="1440" w:header="720" w:footer="720" w:gutter="0"/>
       <w:cols w:space="720"/>
@@ -1156,6 +1160,16 @@
 </file>
 
 <file path=word/footer1.xml><?xml version="1.0" encoding="utf-8"?>
+<w:ftr xmlns:wpc="http://schemas.microsoft.com/office/word/2010/wordprocessingCanvas" xmlns:cx="http://schemas.microsoft.com/office/drawing/2014/chartex" xmlns:cx1="http://schemas.microsoft.com/office/drawing/2015/9/8/chartex" xmlns:cx2="http://schemas.microsoft.com/office/drawing/2015/10/21/chartex" xmlns:cx3="http://schemas.microsoft.com/office/drawing/2016/5/9/chartex" xmlns:cx4="http://schemas.microsoft.com/office/drawing/2016/5/10/chartex" xmlns:cx5="http://schemas.microsoft.com/office/drawing/2016/5/11/chartex" xmlns:cx6="http://schemas.microsoft.com/office/drawing/2016/5/12/chartex" xmlns:cx7="http://schemas.microsoft.com/office/drawing/2016/5/13/chartex" xmlns:cx8="http://schemas.microsoft.com/office/drawing/2016/5/14/chartex" xmlns:mc="http://schemas.openxmlformats.org/markup-compatibility/2006" xmlns:aink="http://schemas.microsoft.com/office/drawing/2016/ink" xmlns:am3d="http://schemas.microsoft.com/office/drawing/2017/model3d" xmlns:o="urn:schemas-microsoft-com:office:office" xmlns:r="http://schemas.openxmlformats.org/officeDocument/2006/relationships" xmlns:m="http://schemas.openxmlformats.org/officeDocument/2006/math" xmlns:v="urn:schemas-microsoft-com:vml" xmlns:wp14="http://schemas.microsoft.com/office/word/2010/wordprocessingDrawing" xmlns:wp="http://schemas.openxmlformats.org/drawingml/2006/wordprocessingDrawing" xmlns:w10="urn:schemas-microsoft-com:office:word" xmlns:w="http://schemas.openxmlformats.org/wordprocessingml/2006/main" xmlns:w14="http://schemas.microsoft.com/office/word/2010/wordml" xmlns:w15="http://schemas.microsoft.com/office/word/2012/wordml" xmlns:w16cex="http://schemas.microsoft.com/office/word/2018/wordml/cex" xmlns:w16cid="http://schemas.microsoft.com/office/word/2016/wordml/cid" xmlns:w16="http://schemas.microsoft.com/office/word/2018/wordml" xmlns:w16sdtdh="http://schemas.microsoft.com/office/word/2020/wordml/sdtdatahash" xmlns:w16se="http://schemas.microsoft.com/office/word/2015/wordml/symex" xmlns:wpg="http://schemas.microsoft.com/office/word/2010/wordprocessingGroup" xmlns:wpi="http://schemas.microsoft.com/office/word/2010/wordprocessingInk" xmlns:wne="http://schemas.microsoft.com/office/word/2006/wordml" xmlns:wps="http://schemas.microsoft.com/office/word/2010/wordprocessingShape" mc:Ignorable="w14 w15 w16se w16cid w16 w16cex w16sdtdh wp14">
+  <w:p>
+    <w:pPr>
+      <w:pStyle w:val="Footer"/>
+    </w:pPr>
+  </w:p>
+</w:ftr>
+</file>
+
+<file path=word/footer2.xml><?xml version="1.0" encoding="utf-8"?>
 <w:ftr xmlns:wpc="http://schemas.microsoft.com/office/word/2010/wordprocessingCanvas" xmlns:cx="http://schemas.microsoft.com/office/drawing/2014/chartex" xmlns:cx1="http://schemas.microsoft.com/office/drawing/2015/9/8/chartex" xmlns:cx2="http://schemas.microsoft.com/office/drawing/2015/10/21/chartex" xmlns:cx3="http://schemas.microsoft.com/office/drawing/2016/5/9/chartex" xmlns:cx4="http://schemas.microsoft.com/office/drawing/2016/5/10/chartex" xmlns:cx5="http://schemas.microsoft.com/office/drawing/2016/5/11/chartex" xmlns:cx6="http://schemas.microsoft.com/office/drawing/2016/5/12/chartex" xmlns:cx7="http://schemas.microsoft.com/office/drawing/2016/5/13/chartex" xmlns:cx8="http://schemas.microsoft.com/office/drawing/2016/5/14/chartex" xmlns:mc="http://schemas.openxmlformats.org/markup-compatibility/2006" xmlns:aink="http://schemas.microsoft.com/office/drawing/2016/ink" xmlns:am3d="http://schemas.microsoft.com/office/drawing/2017/model3d" xmlns:o="urn:schemas-microsoft-com:office:office" xmlns:r="http://schemas.openxmlformats.org/officeDocument/2006/relationships" xmlns:m="http://schemas.openxmlformats.org/officeDocument/2006/math" xmlns:v="urn:schemas-microsoft-com:vml" xmlns:wp14="http://schemas.microsoft.com/office/word/2010/wordprocessingDrawing" xmlns:wp="http://schemas.openxmlformats.org/drawingml/2006/wordprocessingDrawing" xmlns:w10="urn:schemas-microsoft-com:office:word" xmlns:w="http://schemas.openxmlformats.org/wordprocessingml/2006/main" xmlns:w14="http://schemas.microsoft.com/office/word/2010/wordml" xmlns:w15="http://schemas.microsoft.com/office/word/2012/wordml" xmlns:w16cex="http://schemas.microsoft.com/office/word/2018/wordml/cex" xmlns:w16cid="http://schemas.microsoft.com/office/word/2016/wordml/cid" xmlns:w16="http://schemas.microsoft.com/office/word/2018/wordml" xmlns:w16sdtdh="http://schemas.microsoft.com/office/word/2020/wordml/sdtdatahash" xmlns:w16se="http://schemas.microsoft.com/office/word/2015/wordml/symex" xmlns:wpg="http://schemas.microsoft.com/office/word/2010/wordprocessingGroup" xmlns:wpi="http://schemas.microsoft.com/office/word/2010/wordprocessingInk" xmlns:wne="http://schemas.microsoft.com/office/word/2006/wordml" xmlns:wps="http://schemas.microsoft.com/office/word/2010/wordprocessingShape" mc:Ignorable="w14 w15 w16se w16cid w16 w16cex w16sdtdh wp14">
   <w:sdt>
     <w:sdtPr>
@@ -1208,6 +1222,16 @@
 </w:ftr>
 </file>
 
+<file path=word/footer3.xml><?xml version="1.0" encoding="utf-8"?>
+<w:ftr xmlns:wpc="http://schemas.microsoft.com/office/word/2010/wordprocessingCanvas" xmlns:cx="http://schemas.microsoft.com/office/drawing/2014/chartex" xmlns:cx1="http://schemas.microsoft.com/office/drawing/2015/9/8/chartex" xmlns:cx2="http://schemas.microsoft.com/office/drawing/2015/10/21/chartex" xmlns:cx3="http://schemas.microsoft.com/office/drawing/2016/5/9/chartex" xmlns:cx4="http://schemas.microsoft.com/office/drawing/2016/5/10/chartex" xmlns:cx5="http://schemas.microsoft.com/office/drawing/2016/5/11/chartex" xmlns:cx6="http://schemas.microsoft.com/office/drawing/2016/5/12/chartex" xmlns:cx7="http://schemas.microsoft.com/office/drawing/2016/5/13/chartex" xmlns:cx8="http://schemas.microsoft.com/office/drawing/2016/5/14/chartex" xmlns:mc="http://schemas.openxmlformats.org/markup-compatibility/2006" xmlns:aink="http://schemas.microsoft.com/office/drawing/2016/ink" xmlns:am3d="http://schemas.microsoft.com/office/drawing/2017/model3d" xmlns:o="urn:schemas-microsoft-com:office:office" xmlns:r="http://schemas.openxmlformats.org/officeDocument/2006/relationships" xmlns:m="http://schemas.openxmlformats.org/officeDocument/2006/math" xmlns:v="urn:schemas-microsoft-com:vml" xmlns:wp14="http://schemas.microsoft.com/office/word/2010/wordprocessingDrawing" xmlns:wp="http://schemas.openxmlformats.org/drawingml/2006/wordprocessingDrawing" xmlns:w10="urn:schemas-microsoft-com:office:word" xmlns:w="http://schemas.openxmlformats.org/wordprocessingml/2006/main" xmlns:w14="http://schemas.microsoft.com/office/word/2010/wordml" xmlns:w15="http://schemas.microsoft.com/office/word/2012/wordml" xmlns:w16cex="http://schemas.microsoft.com/office/word/2018/wordml/cex" xmlns:w16cid="http://schemas.microsoft.com/office/word/2016/wordml/cid" xmlns:w16="http://schemas.microsoft.com/office/word/2018/wordml" xmlns:w16sdtdh="http://schemas.microsoft.com/office/word/2020/wordml/sdtdatahash" xmlns:w16se="http://schemas.microsoft.com/office/word/2015/wordml/symex" xmlns:wpg="http://schemas.microsoft.com/office/word/2010/wordprocessingGroup" xmlns:wpi="http://schemas.microsoft.com/office/word/2010/wordprocessingInk" xmlns:wne="http://schemas.microsoft.com/office/word/2006/wordml" xmlns:wps="http://schemas.microsoft.com/office/word/2010/wordprocessingShape" mc:Ignorable="w14 w15 w16se w16cid w16 w16cex w16sdtdh wp14">
+  <w:p>
+    <w:pPr>
+      <w:pStyle w:val="Footer"/>
+    </w:pPr>
+  </w:p>
+</w:ftr>
+</file>
+
 <file path=word/footnotes.xml><?xml version="1.0" encoding="utf-8"?>
 <w:footnotes xmlns:wpc="http://schemas.microsoft.com/office/word/2010/wordprocessingCanvas" xmlns:cx="http://schemas.microsoft.com/office/drawing/2014/chartex" xmlns:cx1="http://schemas.microsoft.com/office/drawing/2015/9/8/chartex" xmlns:cx2="http://schemas.microsoft.com/office/drawing/2015/10/21/chartex" xmlns:cx3="http://schemas.microsoft.com/office/drawing/2016/5/9/chartex" xmlns:cx4="http://schemas.microsoft.com/office/drawing/2016/5/10/chartex" xmlns:cx5="http://schemas.microsoft.com/office/drawing/2016/5/11/chartex" xmlns:cx6="http://schemas.microsoft.com/office/drawing/2016/5/12/chartex" xmlns:cx7="http://schemas.microsoft.com/office/drawing/2016/5/13/chartex" xmlns:cx8="http://schemas.microsoft.com/office/drawing/2016/5/14/chartex" xmlns:mc="http://schemas.openxmlformats.org/markup-compatibility/2006" xmlns:aink="http://schemas.microsoft.com/office/drawing/2016/ink" xmlns:am3d="http://schemas.microsoft.com/office/drawing/2017/model3d" xmlns:o="urn:schemas-microsoft-com:office:office" xmlns:r="http://schemas.openxmlformats.org/officeDocument/2006/relationships" xmlns:m="http://schemas.openxmlformats.org/officeDocument/2006/math" xmlns:v="urn:schemas-microsoft-com:vml" xmlns:wp14="http://schemas.microsoft.com/office/word/2010/wordprocessingDrawing" xmlns:wp="http://schemas.openxmlformats.org/drawingml/2006/wordprocessingDrawing" xmlns:w10="urn:schemas-microsoft-com:office:word" xmlns:w="http://schemas.openxmlformats.org/wordprocessingml/2006/main" xmlns:w14="http://schemas.microsoft.com/office/word/2010/wordml" xmlns:w15="http://schemas.microsoft.com/office/word/2012/wordml" xmlns:w16cex="http://schemas.microsoft.com/office/word/2018/wordml/cex" xmlns:w16cid="http://schemas.microsoft.com/office/word/2016/wordml/cid" xmlns:w16="http://schemas.microsoft.com/office/word/2018/wordml" xmlns:w16sdtdh="http://schemas.microsoft.com/office/word/2020/wordml/sdtdatahash" xmlns:w16se="http://schemas.microsoft.com/office/word/2015/wordml/symex" xmlns:wpg="http://schemas.microsoft.com/office/word/2010/wordprocessingGroup" xmlns:wpi="http://schemas.microsoft.com/office/word/2010/wordprocessingInk" xmlns:wne="http://schemas.microsoft.com/office/word/2006/wordml" xmlns:wps="http://schemas.microsoft.com/office/word/2010/wordprocessingShape" mc:Ignorable="w14 w15 w16se w16cid w16 w16cex w16sdtdh wp14">
   <w:footnote w:type="separator" w:id="-1">
@@ -1239,38 +1263,43 @@
     <w:pPr>
       <w:pStyle w:val="Header"/>
     </w:pPr>
-    <w:proofErr w:type="spellStart"/>
+  </w:p>
+</w:hdr>
+</file>
+
+<file path=word/header2.xml><?xml version="1.0" encoding="utf-8"?>
+<w:hdr xmlns:wpc="http://schemas.microsoft.com/office/word/2010/wordprocessingCanvas" xmlns:cx="http://schemas.microsoft.com/office/drawing/2014/chartex" xmlns:cx1="http://schemas.microsoft.com/office/drawing/2015/9/8/chartex" xmlns:cx2="http://schemas.microsoft.com/office/drawing/2015/10/21/chartex" xmlns:cx3="http://schemas.microsoft.com/office/drawing/2016/5/9/chartex" xmlns:cx4="http://schemas.microsoft.com/office/drawing/2016/5/10/chartex" xmlns:cx5="http://schemas.microsoft.com/office/drawing/2016/5/11/chartex" xmlns:cx6="http://schemas.microsoft.com/office/drawing/2016/5/12/chartex" xmlns:cx7="http://schemas.microsoft.com/office/drawing/2016/5/13/chartex" xmlns:cx8="http://schemas.microsoft.com/office/drawing/2016/5/14/chartex" xmlns:mc="http://schemas.openxmlformats.org/markup-compatibility/2006" xmlns:aink="http://schemas.microsoft.com/office/drawing/2016/ink" xmlns:am3d="http://schemas.microsoft.com/office/drawing/2017/model3d" xmlns:o="urn:schemas-microsoft-com:office:office" xmlns:r="http://schemas.openxmlformats.org/officeDocument/2006/relationships" xmlns:m="http://schemas.openxmlformats.org/officeDocument/2006/math" xmlns:v="urn:schemas-microsoft-com:vml" xmlns:wp14="http://schemas.microsoft.com/office/word/2010/wordprocessingDrawing" xmlns:wp="http://schemas.openxmlformats.org/drawingml/2006/wordprocessingDrawing" xmlns:w10="urn:schemas-microsoft-com:office:word" xmlns:w="http://schemas.openxmlformats.org/wordprocessingml/2006/main" xmlns:w14="http://schemas.microsoft.com/office/word/2010/wordml" xmlns:w15="http://schemas.microsoft.com/office/word/2012/wordml" xmlns:w16cex="http://schemas.microsoft.com/office/word/2018/wordml/cex" xmlns:w16cid="http://schemas.microsoft.com/office/word/2016/wordml/cid" xmlns:w16="http://schemas.microsoft.com/office/word/2018/wordml" xmlns:w16sdtdh="http://schemas.microsoft.com/office/word/2020/wordml/sdtdatahash" xmlns:w16se="http://schemas.microsoft.com/office/word/2015/wordml/symex" xmlns:wpg="http://schemas.microsoft.com/office/word/2010/wordprocessingGroup" xmlns:wpi="http://schemas.microsoft.com/office/word/2010/wordprocessingInk" xmlns:wne="http://schemas.microsoft.com/office/word/2006/wordml" xmlns:wps="http://schemas.microsoft.com/office/word/2010/wordprocessingShape" mc:Ignorable="w14 w15 w16se w16cid w16 w16cex w16sdtdh wp14">
+  <w:p>
+    <w:pPr>
+      <w:pStyle w:val="Header"/>
+      <w:rPr>
+        <w:lang w:val="vi-VN"/>
+      </w:rPr>
+    </w:pPr>
     <w:r>
-      <w:t>Nguyễn</w:t>
+      <w:rPr>
+        <w:lang w:val="vi-VN"/>
+      </w:rPr>
+      <w:t>Bùi Mạnh Hiếu – 22003155 -Tuan01</w:t>
     </w:r>
-    <w:proofErr w:type="spellEnd"/>
-    <w:r>
-      <w:t xml:space="preserve"> </w:t>
-    </w:r>
-    <w:proofErr w:type="spellStart"/>
-    <w:r>
-      <w:t>Ngọc</w:t>
-    </w:r>
-    <w:proofErr w:type="spellEnd"/>
-    <w:r>
-      <w:t xml:space="preserve"> </w:t>
-    </w:r>
-    <w:proofErr w:type="spellStart"/>
-    <w:r>
-      <w:t>Hiền</w:t>
-    </w:r>
-    <w:proofErr w:type="spellEnd"/>
-    <w:r>
-      <w:t xml:space="preserve"> – 22000865 – </w:t>
-    </w:r>
-    <w:proofErr w:type="spellStart"/>
-    <w:r>
-      <w:t>Tuần</w:t>
-    </w:r>
-    <w:proofErr w:type="spellEnd"/>
-    <w:r>
-      <w:t xml:space="preserve"> 01</w:t>
-    </w:r>
+  </w:p>
+  <w:p>
+    <w:pPr>
+      <w:pStyle w:val="Header"/>
+      <w:rPr>
+        <w:lang w:val="vi-VN"/>
+      </w:rPr>
+    </w:pPr>
+  </w:p>
+</w:hdr>
+</file>
+
+<file path=word/header3.xml><?xml version="1.0" encoding="utf-8"?>
+<w:hdr xmlns:wpc="http://schemas.microsoft.com/office/word/2010/wordprocessingCanvas" xmlns:cx="http://schemas.microsoft.com/office/drawing/2014/chartex" xmlns:cx1="http://schemas.microsoft.com/office/drawing/2015/9/8/chartex" xmlns:cx2="http://schemas.microsoft.com/office/drawing/2015/10/21/chartex" xmlns:cx3="http://schemas.microsoft.com/office/drawing/2016/5/9/chartex" xmlns:cx4="http://schemas.microsoft.com/office/drawing/2016/5/10/chartex" xmlns:cx5="http://schemas.microsoft.com/office/drawing/2016/5/11/chartex" xmlns:cx6="http://schemas.microsoft.com/office/drawing/2016/5/12/chartex" xmlns:cx7="http://schemas.microsoft.com/office/drawing/2016/5/13/chartex" xmlns:cx8="http://schemas.microsoft.com/office/drawing/2016/5/14/chartex" xmlns:mc="http://schemas.openxmlformats.org/markup-compatibility/2006" xmlns:aink="http://schemas.microsoft.com/office/drawing/2016/ink" xmlns:am3d="http://schemas.microsoft.com/office/drawing/2017/model3d" xmlns:o="urn:schemas-microsoft-com:office:office" xmlns:r="http://schemas.openxmlformats.org/officeDocument/2006/relationships" xmlns:m="http://schemas.openxmlformats.org/officeDocument/2006/math" xmlns:v="urn:schemas-microsoft-com:vml" xmlns:wp14="http://schemas.microsoft.com/office/word/2010/wordprocessingDrawing" xmlns:wp="http://schemas.openxmlformats.org/drawingml/2006/wordprocessingDrawing" xmlns:w10="urn:schemas-microsoft-com:office:word" xmlns:w="http://schemas.openxmlformats.org/wordprocessingml/2006/main" xmlns:w14="http://schemas.microsoft.com/office/word/2010/wordml" xmlns:w15="http://schemas.microsoft.com/office/word/2012/wordml" xmlns:w16cex="http://schemas.microsoft.com/office/word/2018/wordml/cex" xmlns:w16cid="http://schemas.microsoft.com/office/word/2016/wordml/cid" xmlns:w16="http://schemas.microsoft.com/office/word/2018/wordml" xmlns:w16sdtdh="http://schemas.microsoft.com/office/word/2020/wordml/sdtdatahash" xmlns:w16se="http://schemas.microsoft.com/office/word/2015/wordml/symex" xmlns:wpg="http://schemas.microsoft.com/office/word/2010/wordprocessingGroup" xmlns:wpi="http://schemas.microsoft.com/office/word/2010/wordprocessingInk" xmlns:wne="http://schemas.microsoft.com/office/word/2006/wordml" xmlns:wps="http://schemas.microsoft.com/office/word/2010/wordprocessingShape" mc:Ignorable="w14 w15 w16se w16cid w16 w16cex w16sdtdh wp14">
+  <w:p>
+    <w:pPr>
+      <w:pStyle w:val="Header"/>
+    </w:pPr>
   </w:p>
 </w:hdr>
 </file>
@@ -1398,6 +1427,7 @@
     <w:lsdException w:name="HTML Sample" w:semiHidden="1" w:unhideWhenUsed="1"/>
     <w:lsdException w:name="HTML Typewriter" w:semiHidden="1" w:unhideWhenUsed="1"/>
     <w:lsdException w:name="HTML Variable" w:semiHidden="1" w:unhideWhenUsed="1"/>
+    <w:lsdException w:name="Normal Table" w:semiHidden="1" w:unhideWhenUsed="1"/>
     <w:lsdException w:name="annotation subject" w:semiHidden="1" w:unhideWhenUsed="1"/>
     <w:lsdException w:name="No List" w:semiHidden="1" w:unhideWhenUsed="1"/>
     <w:lsdException w:name="Outline List 1" w:semiHidden="1" w:unhideWhenUsed="1"/>
@@ -1440,8 +1470,11 @@
     <w:lsdException w:name="Table Contemporary" w:semiHidden="1" w:unhideWhenUsed="1"/>
     <w:lsdException w:name="Table Elegant" w:semiHidden="1" w:unhideWhenUsed="1"/>
     <w:lsdException w:name="Table Professional" w:semiHidden="1" w:unhideWhenUsed="1"/>
+    <w:lsdException w:name="Table Subtle 1" w:semiHidden="1" w:unhideWhenUsed="1"/>
     <w:lsdException w:name="Table Subtle 2" w:semiHidden="1" w:unhideWhenUsed="1"/>
     <w:lsdException w:name="Table Web 1" w:semiHidden="1" w:unhideWhenUsed="1"/>
+    <w:lsdException w:name="Table Web 2" w:semiHidden="1" w:unhideWhenUsed="1"/>
+    <w:lsdException w:name="Table Web 3" w:semiHidden="1" w:unhideWhenUsed="1"/>
     <w:lsdException w:name="Balloon Text" w:semiHidden="1" w:unhideWhenUsed="1"/>
     <w:lsdException w:name="Table Grid" w:uiPriority="39"/>
     <w:lsdException w:name="Table Theme" w:semiHidden="1" w:unhideWhenUsed="1"/>
@@ -2003,4 +2036,16 @@
     </a:ext>
   </a:extLst>
 </a:theme>
+</file>
+
+<file path=customXml/item1.xml><?xml version="1.0" encoding="utf-8"?>
+<b:Sources xmlns:b="http://schemas.openxmlformats.org/officeDocument/2006/bibliography" xmlns="http://schemas.openxmlformats.org/officeDocument/2006/bibliography" SelectedStyle="/APASixthEditionOfficeOnline.xsl" StyleName="APA" Version="6"/>
+</file>
+
+<file path=customXml/itemProps1.xml><?xml version="1.0" encoding="utf-8"?>
+<ds:datastoreItem xmlns:ds="http://schemas.openxmlformats.org/officeDocument/2006/customXml" ds:itemID="{B8B17707-5199-3849-89D3-C42A8D02A00C}">
+  <ds:schemaRefs>
+    <ds:schemaRef ds:uri="http://schemas.openxmlformats.org/officeDocument/2006/bibliography"/>
+  </ds:schemaRefs>
+</ds:datastoreItem>
 </file>
</xml_diff>